<commit_message>
Rabiola em cadeia no formato da imagem de referência
Laços viram bandeirolas inclinadas para a direita; o laço B passa a ser filho do laço A (M_B = M_A · T · Rz), acumulando o balanço. Relatório atualizado (seções 4.3 e 6.2), corrigindo também os pontos de amarração que estavam divergentes do código.
</commit_message>
<xml_diff>
--- a/RELATORIO.docx
+++ b/RELATORIO.docx
@@ -217,7 +217,7 @@
         <w:pStyle w:val="Normal"/>
       </w:pPr>
       <w:r>
-        <w:t xml:space="preserve">A rabiola é composta por dois laços triangulares cor-de-laranja, dispostos ao longo de uma linha fina implícita que desce da ponta inferior da pipa. Cada laço é um único triângulo com o pivô no topo (0,0) e corpo em (±0,08; -0,18), ambos na cor laranja (1,00; 0,50; 0,00; 1). Os laços são empilhados verticalmente, com pivôs em (0; -0,50) e (0; -0,72), o que sugere a linha sem precisar desenhar uma primitiva de reta. Cada laço é um shape separado, pois possui transformação própria.</w:t>
+        <w:t xml:space="preserve">A rabiola é composta por dois laços triangulares cor-de-laranja (1,00; 0,50; 0,00; 1), inclinados para a direita como bandeirolas. Cada laço é um único triângulo com o pivô no vértice superior (0,0) e os demais vértices em (0,21; -0,155) e (0,04; -0,25). O primeiro laço é amarrado logo abaixo da ponta inferior da pipa, em (0; -0,62); o segundo é amarrado no ponto médio da aresta inferior do primeiro, em (0,125; -0,2025) nas coordenadas locais do laço A, formando uma cadeia. Cada laço é um shape separado, pois possui transformação própria.</w:t>
       </w:r>
     </w:p>
     <w:p>
@@ -349,7 +349,7 @@
         <w:pStyle w:val="Normal"/>
       </w:pPr>
       <w:r>
-        <w:t xml:space="preserve">Cada laço herda a transformação da pipa e acrescenta um pivô sobre a linha e a oscilação própria, o que garante um movimento diferente, porém coerente, em relação à pipa:</w:t>
+        <w:t xml:space="preserve">Os laços formam uma hierarquia: o laço A é filho da pipa e o laço B é filho do laço A. Cada um herda a transformação do pai e acrescenta uma translação até o ponto de amarração e uma oscilação própria, o que garante um movimento diferente, porém coerente, em relação à pipa:</w:t>
       </w:r>
     </w:p>
     <w:p>
@@ -357,33 +357,33 @@
         <w:pStyle w:val="Code"/>
       </w:pPr>
       <w:r>
-        <w:t xml:space="preserve">M_laco_i = M_pipa · T(0, attachY_i, 0) · Rz(swing_i)</w:t>
-      </w:r>
-      <w:r>
-        <w:br/>
-      </w:r>
-      <w:r>
-        <w:t xml:space="preserve">attachY_i = {-0,50 ; -0,72}</w:t>
-      </w:r>
-      <w:r>
-        <w:br/>
-      </w:r>
-      <w:r>
-        <w:t xml:space="preserve">swing_A  = 0,45·sin(1,4·w·t)        + 0,12·sin(2,7·w·t + 1,0)</w:t>
-      </w:r>
-      <w:r>
-        <w:br/>
-      </w:r>
-      <w:r>
-        <w:t xml:space="preserve">swing_B  = 0,40·sin(1,4·w·t + 1,8)  + 0,15·sin(2,5·w·t + 0,5)</w:t>
-      </w:r>
-    </w:p>
-    <w:p>
-      <w:pPr>
-        <w:pStyle w:val="Normal"/>
-      </w:pPr>
-      <w:r>
-        <w:t xml:space="preserve">As fases e frequências diferentes fazem os dois laços se moverem de maneira distinta; o fato de ambos serem multiplicados por M_pipa garante que acompanhem a pipa, mantendo a coerência do conjunto.</w:t>
+        <w:t xml:space="preserve">M_laco_A = M_pipa   · T(0; -0,62; 0)       · Rz(swing_A)</w:t>
+      </w:r>
+      <w:r>
+        <w:br/>
+      </w:r>
+      <w:r>
+        <w:t xml:space="preserve">M_laco_B = M_laco_A · T(0,125; -0,2025; 0) · Rz(swing_B)</w:t>
+      </w:r>
+      <w:r>
+        <w:br/>
+      </w:r>
+      <w:r>
+        <w:t xml:space="preserve">swing_A  = 0,30·sin(1,4·w·t)        + 0,08·sin(2,7·w·t + 1,0)</w:t>
+      </w:r>
+      <w:r>
+        <w:br/>
+      </w:r>
+      <w:r>
+        <w:t xml:space="preserve">swing_B  = 0,30·sin(1,4·w·t + 1,2)  + 0,10·sin(2,5·w·t + 0,5)</w:t>
+      </w:r>
+    </w:p>
+    <w:p>
+      <w:pPr>
+        <w:pStyle w:val="Normal"/>
+      </w:pPr>
+      <w:r>
+        <w:t xml:space="preserve">As fases e frequências diferentes fazem os dois laços se moverem de maneira distinta. Como M_laco_B contém M_laco_A, que por sua vez contém M_pipa, o laço B acumula a oscilação do laço A, como uma corrente: a rabiola acompanha a pipa e ondula de forma progressiva, mantendo a coerência do conjunto.</w:t>
       </w:r>
     </w:p>
     <w:p>

</xml_diff>